<commit_message>
P4 AJC: fix sent-back requirements — titlepage + 7 declarations, remove Declarations from blinded manuscript, docx editable source
- Titlepage: add Consent to Participate + Consent to Publish (Not applicable), align headings (Ethical Approval, Competing Interests, Data Availability Statement, Authors' Individual Contributions)
- Manuscript blinded: remove 'Declarations' section (moved to titlepage)
- Regenerate DOCX (editable source) for both
- Response to AJOC-D-26-00322 Manuscript Sent Back (13 Aug 2026)

Co-Authored-By: Claude <noreply@anthropic.com>
</commit_message>
<xml_diff>
--- a/reports/paper4_manuscript_blinded.docx
+++ b/reports/paper4_manuscript_blinded.docx
@@ -2,7 +2,7 @@
 <file path=word/document.xml><?xml version="1.0" encoding="utf-8"?>
 <w:document xmlns:w="http://schemas.openxmlformats.org/wordprocessingml/2006/main" xmlns:m="http://schemas.openxmlformats.org/officeDocument/2006/math" xmlns:r="http://schemas.openxmlformats.org/officeDocument/2006/relationships" xmlns:o="urn:schemas-microsoft-com:office:office" xmlns:v="urn:schemas-microsoft-com:vml" xmlns:w10="urn:schemas-microsoft-com:office:word" xmlns:a="http://schemas.openxmlformats.org/drawingml/2006/main" xmlns:pic="http://schemas.openxmlformats.org/drawingml/2006/picture" xmlns:wp="http://schemas.openxmlformats.org/drawingml/2006/wordprocessingDrawing">
   <w:body>
-    <w:bookmarkStart w:id="35" w:name="X4c6a7cf2b0108cdcbd22990e713d06ab6e1f846"/>
+    <w:bookmarkStart w:id="34" w:name="X4c6a7cf2b0108cdcbd22990e713d06ab6e1f846"/>
     <w:p>
       <w:pPr>
         <w:pStyle w:val="Heading1"/>
@@ -2551,13 +2551,13 @@
       </w:r>
     </w:p>
     <w:bookmarkEnd w:id="32"/>
-    <w:bookmarkStart w:id="33" w:name="declarations"/>
+    <w:bookmarkStart w:id="33" w:name="references"/>
     <w:p>
       <w:pPr>
         <w:pStyle w:val="Heading2"/>
       </w:pPr>
       <w:r>
-        <w:t xml:space="preserve">Declarations</w:t>
+        <w:t xml:space="preserve">References</w:t>
       </w:r>
     </w:p>
     <w:p>
@@ -2565,545 +2565,437 @@
         <w:pStyle w:val="FirstParagraph"/>
       </w:pPr>
       <w:r>
-        <w:rPr>
-          <w:b/>
-          <w:bCs/>
-        </w:rPr>
-        <w:t xml:space="preserve">Funding.</w:t>
-      </w:r>
-      <w:r>
-        <w:t xml:space="preserve"> </w:t>
-      </w:r>
-      <w:r>
-        <w:t xml:space="preserve">This research received no external funding.</w:t>
-      </w:r>
-      <w:r>
-        <w:t xml:space="preserve"> </w:t>
-      </w:r>
-      <w:r>
-        <w:rPr>
-          <w:b/>
-          <w:bCs/>
-        </w:rPr>
-        <w:t xml:space="preserve">Conflicts of interest.</w:t>
-      </w:r>
-      <w:r>
-        <w:t xml:space="preserve"> </w:t>
-      </w:r>
-      <w:r>
-        <w:t xml:space="preserve">The authors declare no conflicts of interest.</w:t>
-      </w:r>
-      <w:r>
-        <w:t xml:space="preserve"> </w:t>
-      </w:r>
-      <w:r>
-        <w:rPr>
-          <w:b/>
-          <w:bCs/>
-        </w:rPr>
-        <w:t xml:space="preserve">Ethics approval.</w:t>
-      </w:r>
-      <w:r>
-        <w:t xml:space="preserve"> </w:t>
-      </w:r>
-      <w:r>
-        <w:t xml:space="preserve">This study analyzes publicly available court documents published by the Indonesian Supreme Court. No human subjects were involved and no ethics approval was required.</w:t>
-      </w:r>
-      <w:r>
-        <w:t xml:space="preserve"> </w:t>
-      </w:r>
-      <w:r>
-        <w:rPr>
-          <w:b/>
-          <w:bCs/>
-        </w:rPr>
-        <w:t xml:space="preserve">Data availability.</w:t>
-      </w:r>
-      <w:r>
-        <w:t xml:space="preserve"> </w:t>
-      </w:r>
-      <w:r>
-        <w:t xml:space="preserve">The CorpusKorupsi structured dataset and analysis scripts will be made available upon publication.</w:t>
-      </w:r>
-      <w:r>
-        <w:t xml:space="preserve"> </w:t>
-      </w:r>
-      <w:r>
-        <w:rPr>
-          <w:b/>
-          <w:bCs/>
-        </w:rPr>
-        <w:t xml:space="preserve">Author contributions.</w:t>
-      </w:r>
-      <w:r>
-        <w:t xml:space="preserve"> </w:t>
-      </w:r>
-      <w:r>
-        <w:t xml:space="preserve">MA conceived the study, assembled and audited the corpus, and ran the statistical analyses. GFG contributed to the research design, the comparative benchmark, and manuscript revision. Both authors approved the final manuscript.</w:t>
-      </w:r>
-      <w:r>
-        <w:t xml:space="preserve"> </w:t>
-      </w:r>
-      <w:r>
-        <w:rPr>
-          <w:b/>
-          <w:bCs/>
-        </w:rPr>
-        <w:t xml:space="preserve">Use of AI-assisted tools.</w:t>
-      </w:r>
-      <w:r>
-        <w:t xml:space="preserve"> </w:t>
-      </w:r>
-      <w:r>
-        <w:t xml:space="preserve">The authors used Claude (Anthropic) as a computational research assistant for programming, statistical analysis, and manuscript drafting. All analyses were independently verified through reproducible scripts, and the authors take full responsibility for all scientific claims and interpretations.</w:t>
+        <w:t xml:space="preserve">Ashworth, A. (2015).</w:t>
+      </w:r>
+      <w:r>
+        <w:t xml:space="preserve"> </w:t>
+      </w:r>
+      <w:r>
+        <w:rPr>
+          <w:i/>
+          <w:iCs/>
+        </w:rPr>
+        <w:t xml:space="preserve">Sentencing and Criminal Justice</w:t>
+      </w:r>
+      <w:r>
+        <w:t xml:space="preserve"> </w:t>
+      </w:r>
+      <w:r>
+        <w:t xml:space="preserve">(6th ed.). Cambridge University Press.</w:t>
+      </w:r>
+    </w:p>
+    <w:p>
+      <w:pPr>
+        <w:pStyle w:val="BodyText"/>
+      </w:pPr>
+      <w:r>
+        <w:t xml:space="preserve">Author (2026a). CorpusKorupsi: A Computational Corpus of Indonesian Supreme Court Corruption Verdicts and Sentencing Patterns. [Companion paper]</w:t>
+      </w:r>
+    </w:p>
+    <w:p>
+      <w:pPr>
+        <w:pStyle w:val="BodyText"/>
+      </w:pPr>
+      <w:r>
+        <w:t xml:space="preserve">Author (2026b). Charge Type, Judicial Opacity, and the Limits of Prediction: A Computational Analysis of Indonesian Corruption Sentences. SSRN Working Paper No. 6574140. https://ssrn.com/abstract=6574140</w:t>
+      </w:r>
+    </w:p>
+    <w:p>
+      <w:pPr>
+        <w:pStyle w:val="BodyText"/>
+      </w:pPr>
+      <w:r>
+        <w:t xml:space="preserve">Author (2026c). Bidirectional Correction: How Indonesian Judges Override Low Prosecution Demands in Corruption Cases. [Companion paper]</w:t>
+      </w:r>
+    </w:p>
+    <w:p>
+      <w:pPr>
+        <w:pStyle w:val="BodyText"/>
+      </w:pPr>
+      <w:r>
+        <w:t xml:space="preserve">Becker, G. S. (1968). Crime and Punishment: An Economic Approach.</w:t>
+      </w:r>
+      <w:r>
+        <w:t xml:space="preserve"> </w:t>
+      </w:r>
+      <w:r>
+        <w:rPr>
+          <w:i/>
+          <w:iCs/>
+        </w:rPr>
+        <w:t xml:space="preserve">Journal of Political Economy</w:t>
+      </w:r>
+      <w:r>
+        <w:t xml:space="preserve">, 76(2), 169-217. https://doi.org/10.1086/259394</w:t>
+      </w:r>
+    </w:p>
+    <w:p>
+      <w:pPr>
+        <w:pStyle w:val="BodyText"/>
+      </w:pPr>
+      <w:r>
+        <w:t xml:space="preserve">Bennett, M. W., Levinson, J. D., &amp; Hioki, K. (2017). Judging Federal White-Collar Fraud Sentencing: An Empirical Study Revealing the Need for Further Reform.</w:t>
+      </w:r>
+      <w:r>
+        <w:t xml:space="preserve"> </w:t>
+      </w:r>
+      <w:r>
+        <w:rPr>
+          <w:i/>
+          <w:iCs/>
+        </w:rPr>
+        <w:t xml:space="preserve">Iowa Law Review</w:t>
+      </w:r>
+      <w:r>
+        <w:t xml:space="preserve">, 102, 939-1000.</w:t>
+      </w:r>
+    </w:p>
+    <w:p>
+      <w:pPr>
+        <w:pStyle w:val="BodyText"/>
+      </w:pPr>
+      <w:r>
+        <w:t xml:space="preserve">Bibas, S. (2004). Plea Bargaining outside the Shadow of Trial.</w:t>
+      </w:r>
+      <w:r>
+        <w:t xml:space="preserve"> </w:t>
+      </w:r>
+      <w:r>
+        <w:rPr>
+          <w:i/>
+          <w:iCs/>
+        </w:rPr>
+        <w:t xml:space="preserve">Harvard Law Review</w:t>
+      </w:r>
+      <w:r>
+        <w:t xml:space="preserve">, 117(8), 2463-2547.</w:t>
+      </w:r>
+    </w:p>
+    <w:p>
+      <w:pPr>
+        <w:pStyle w:val="BodyText"/>
+      </w:pPr>
+      <w:r>
+        <w:t xml:space="preserve">Davis, K. C. (1969).</w:t>
+      </w:r>
+      <w:r>
+        <w:t xml:space="preserve"> </w:t>
+      </w:r>
+      <w:r>
+        <w:rPr>
+          <w:i/>
+          <w:iCs/>
+        </w:rPr>
+        <w:t xml:space="preserve">Discretionary Justice: A Preliminary Inquiry</w:t>
+      </w:r>
+      <w:r>
+        <w:t xml:space="preserve">. Louisiana State University Press.</w:t>
+      </w:r>
+    </w:p>
+    <w:p>
+      <w:pPr>
+        <w:pStyle w:val="BodyText"/>
+      </w:pPr>
+      <w:r>
+        <w:t xml:space="preserve">Englich, B., Mussweiler, T., &amp; Strack, F. (2006). Playing dice with criminal sentences: The influence of irrelevant anchors on experts’ judicial decision making.</w:t>
+      </w:r>
+      <w:r>
+        <w:t xml:space="preserve"> </w:t>
+      </w:r>
+      <w:r>
+        <w:rPr>
+          <w:i/>
+          <w:iCs/>
+        </w:rPr>
+        <w:t xml:space="preserve">Personality and Social Psychology Bulletin</w:t>
+      </w:r>
+      <w:r>
+        <w:t xml:space="preserve">, 32(2), 188-200.</w:t>
+      </w:r>
+    </w:p>
+    <w:p>
+      <w:pPr>
+        <w:pStyle w:val="BodyText"/>
+      </w:pPr>
+      <w:r>
+        <w:t xml:space="preserve">Hewitt, J. (2016). Fifty Shades of Gray: Sentencing Trends in Major White-Collar Cases.</w:t>
+      </w:r>
+      <w:r>
+        <w:t xml:space="preserve"> </w:t>
+      </w:r>
+      <w:r>
+        <w:rPr>
+          <w:i/>
+          <w:iCs/>
+        </w:rPr>
+        <w:t xml:space="preserve">Yale Law Journal</w:t>
+      </w:r>
+      <w:r>
+        <w:t xml:space="preserve">, 125(4), 1018-1071.</w:t>
+      </w:r>
+    </w:p>
+    <w:p>
+      <w:pPr>
+        <w:pStyle w:val="BodyText"/>
+      </w:pPr>
+      <w:r>
+        <w:t xml:space="preserve">Indonesia Corruption Watch (2025). Sentencing trend monitoring report 2024. Jakarta: ICW.</w:t>
+      </w:r>
+    </w:p>
+    <w:p>
+      <w:pPr>
+        <w:pStyle w:val="BodyText"/>
+      </w:pPr>
+      <w:r>
+        <w:t xml:space="preserve">Lambsdorff, J. G. (2007).</w:t>
+      </w:r>
+      <w:r>
+        <w:t xml:space="preserve"> </w:t>
+      </w:r>
+      <w:r>
+        <w:rPr>
+          <w:i/>
+          <w:iCs/>
+        </w:rPr>
+        <w:t xml:space="preserve">The Institutional Economics of Corruption and Reform: Theory, Evidence, and Policy</w:t>
+      </w:r>
+      <w:r>
+        <w:t xml:space="preserve">. Cambridge University Press.</w:t>
+      </w:r>
+    </w:p>
+    <w:p>
+      <w:pPr>
+        <w:pStyle w:val="BodyText"/>
+      </w:pPr>
+      <w:r>
+        <w:t xml:space="preserve">Medvedeva, M., Vols, M., &amp; Wieling, M. (2020). Using machine learning to predict decisions of the European Court of Human Rights.</w:t>
+      </w:r>
+      <w:r>
+        <w:t xml:space="preserve"> </w:t>
+      </w:r>
+      <w:r>
+        <w:rPr>
+          <w:i/>
+          <w:iCs/>
+        </w:rPr>
+        <w:t xml:space="preserve">Artificial Intelligence and Law</w:t>
+      </w:r>
+      <w:r>
+        <w:t xml:space="preserve">, 28(2), 237-266.</w:t>
+      </w:r>
+    </w:p>
+    <w:p>
+      <w:pPr>
+        <w:pStyle w:val="BodyText"/>
+      </w:pPr>
+      <w:r>
+        <w:t xml:space="preserve">Strickson, B., &amp; De La Iglesia, B. (2020). Legal judgement prediction for UK Crown Court criminal cases.</w:t>
+      </w:r>
+      <w:r>
+        <w:t xml:space="preserve"> </w:t>
+      </w:r>
+      <w:r>
+        <w:rPr>
+          <w:i/>
+          <w:iCs/>
+        </w:rPr>
+        <w:t xml:space="preserve">Proceedings of ICAART</w:t>
+      </w:r>
+      <w:r>
+        <w:t xml:space="preserve">, 458-465.</w:t>
+      </w:r>
+    </w:p>
+    <w:p>
+      <w:pPr>
+        <w:pStyle w:val="BodyText"/>
+      </w:pPr>
+      <w:r>
+        <w:t xml:space="preserve">Tversky, A., &amp; Kahneman, D. (1974). Judgment under Uncertainty: Heuristics and Biases.</w:t>
+      </w:r>
+      <w:r>
+        <w:t xml:space="preserve"> </w:t>
+      </w:r>
+      <w:r>
+        <w:rPr>
+          <w:i/>
+          <w:iCs/>
+        </w:rPr>
+        <w:t xml:space="preserve">Science</w:t>
+      </w:r>
+      <w:r>
+        <w:t xml:space="preserve">, 185(4157), 1124-1131. https://doi.org/10.1126/science.185.4157.1124</w:t>
+      </w:r>
+    </w:p>
+    <w:p>
+      <w:pPr>
+        <w:pStyle w:val="BodyText"/>
+      </w:pPr>
+      <w:r>
+        <w:t xml:space="preserve">Ulmer, J. T. (2012). Recent developments and new directions in sentencing research.</w:t>
+      </w:r>
+      <w:r>
+        <w:t xml:space="preserve"> </w:t>
+      </w:r>
+      <w:r>
+        <w:rPr>
+          <w:i/>
+          <w:iCs/>
+        </w:rPr>
+        <w:t xml:space="preserve">Justice Quarterly</w:t>
+      </w:r>
+      <w:r>
+        <w:t xml:space="preserve">, 29(1), 1-40.</w:t>
+      </w:r>
+    </w:p>
+    <w:p>
+      <w:pPr>
+        <w:pStyle w:val="BodyText"/>
+      </w:pPr>
+      <w:r>
+        <w:t xml:space="preserve">United States Sentencing Commission (2013).</w:t>
+      </w:r>
+      <w:r>
+        <w:t xml:space="preserve"> </w:t>
+      </w:r>
+      <w:r>
+        <w:rPr>
+          <w:i/>
+          <w:iCs/>
+        </w:rPr>
+        <w:t xml:space="preserve">Sentencing and Guideline Application Information for §2B1.1 Offenders</w:t>
+      </w:r>
+      <w:r>
+        <w:t xml:space="preserve">. Symposium on Economic Crime. Washington, DC: USSC. https://www.ussc.gov/sites/default/files/pdf/research-and-publications/research-projects-and-surveys/economic-crimes/20130918-19-symposium/Sentencing_Guideline_Application_Info.pdf</w:t>
+      </w:r>
+    </w:p>
+    <w:p>
+      <w:pPr>
+        <w:pStyle w:val="BodyText"/>
+      </w:pPr>
+      <w:r>
+        <w:t xml:space="preserve">United States Sentencing Commission (2024).</w:t>
+      </w:r>
+      <w:r>
+        <w:t xml:space="preserve"> </w:t>
+      </w:r>
+      <w:r>
+        <w:rPr>
+          <w:i/>
+          <w:iCs/>
+        </w:rPr>
+        <w:t xml:space="preserve">Guidelines Manual</w:t>
+      </w:r>
+      <w:r>
+        <w:t xml:space="preserve">, §2B1.1 (Theft, Property Destruction, and Fraud). Washington, DC: USSC.</w:t>
+      </w:r>
+    </w:p>
+    <w:p>
+      <w:pPr>
+        <w:pStyle w:val="BodyText"/>
+      </w:pPr>
+      <w:r>
+        <w:t xml:space="preserve">United States Sentencing Commission (2025).</w:t>
+      </w:r>
+      <w:r>
+        <w:t xml:space="preserve"> </w:t>
+      </w:r>
+      <w:r>
+        <w:rPr>
+          <w:i/>
+          <w:iCs/>
+        </w:rPr>
+        <w:t xml:space="preserve">Proposed Amendments to the Federal Sentencing Guidelines: Economic Crime (§2B1.1 Loss Table)</w:t>
+      </w:r>
+      <w:r>
+        <w:t xml:space="preserve">. Washington, DC: USSC.</w:t>
+      </w:r>
+    </w:p>
+    <w:p>
+      <w:pPr>
+        <w:pStyle w:val="BodyText"/>
+      </w:pPr>
+      <w:r>
+        <w:t xml:space="preserve">van Wingerden, S., van Wilsem, J., &amp; Roosma, F. (2016). Sentencing in the Netherlands: Determinants of severity and judicial consistency.</w:t>
+      </w:r>
+      <w:r>
+        <w:t xml:space="preserve"> </w:t>
+      </w:r>
+      <w:r>
+        <w:rPr>
+          <w:i/>
+          <w:iCs/>
+        </w:rPr>
+        <w:t xml:space="preserve">European Journal of Criminology</w:t>
+      </w:r>
+      <w:r>
+        <w:t xml:space="preserve">, 13(4), 489-512.</w:t>
+      </w:r>
+    </w:p>
+    <w:p>
+      <w:pPr>
+        <w:pStyle w:val="BodyText"/>
+      </w:pPr>
+      <w:r>
+        <w:t xml:space="preserve">von Hirsch, A. (1992). Proportionality in the Philosophy of Punishment.</w:t>
+      </w:r>
+      <w:r>
+        <w:t xml:space="preserve"> </w:t>
+      </w:r>
+      <w:r>
+        <w:rPr>
+          <w:i/>
+          <w:iCs/>
+        </w:rPr>
+        <w:t xml:space="preserve">Crime and Justice</w:t>
+      </w:r>
+      <w:r>
+        <w:t xml:space="preserve">, 16, 55-98. https://doi.org/10.1086/449204</w:t>
+      </w:r>
+    </w:p>
+    <w:p>
+      <w:pPr>
+        <w:pStyle w:val="BodyText"/>
+      </w:pPr>
+      <w:r>
+        <w:t xml:space="preserve">Vorenberg, J. (1981). Decent Restraint of Prosecutorial Power.</w:t>
+      </w:r>
+      <w:r>
+        <w:t xml:space="preserve"> </w:t>
+      </w:r>
+      <w:r>
+        <w:rPr>
+          <w:i/>
+          <w:iCs/>
+        </w:rPr>
+        <w:t xml:space="preserve">Harvard Law Review</w:t>
+      </w:r>
+      <w:r>
+        <w:t xml:space="preserve">, 94(7), 1521-1573.</w:t>
+      </w:r>
+    </w:p>
+    <w:p>
+      <w:pPr>
+        <w:pStyle w:val="BodyText"/>
+      </w:pPr>
+      <w:r>
+        <w:t xml:space="preserve">Wittenbrink, F., &amp; Niehaus, S. (2022). Prediction of Criminal Sentencing: A Systematic Review of Models, Outcomes, and Methodological Issues.</w:t>
+      </w:r>
+      <w:r>
+        <w:t xml:space="preserve"> </w:t>
+      </w:r>
+      <w:r>
+        <w:rPr>
+          <w:i/>
+          <w:iCs/>
+        </w:rPr>
+        <w:t xml:space="preserve">European Journal of Criminology and Police Research</w:t>
+      </w:r>
+      <w:r>
+        <w:t xml:space="preserve">, 28, 349-371.</w:t>
       </w:r>
     </w:p>
     <w:bookmarkEnd w:id="33"/>
-    <w:bookmarkStart w:id="34" w:name="references"/>
-    <w:p>
-      <w:pPr>
-        <w:pStyle w:val="Heading2"/>
-      </w:pPr>
-      <w:r>
-        <w:t xml:space="preserve">References</w:t>
-      </w:r>
-    </w:p>
-    <w:p>
-      <w:pPr>
-        <w:pStyle w:val="FirstParagraph"/>
-      </w:pPr>
-      <w:r>
-        <w:t xml:space="preserve">Ashworth, A. (2015).</w:t>
-      </w:r>
-      <w:r>
-        <w:t xml:space="preserve"> </w:t>
-      </w:r>
-      <w:r>
-        <w:rPr>
-          <w:i/>
-          <w:iCs/>
-        </w:rPr>
-        <w:t xml:space="preserve">Sentencing and Criminal Justice</w:t>
-      </w:r>
-      <w:r>
-        <w:t xml:space="preserve"> </w:t>
-      </w:r>
-      <w:r>
-        <w:t xml:space="preserve">(6th ed.). Cambridge University Press.</w:t>
-      </w:r>
-    </w:p>
-    <w:p>
-      <w:pPr>
-        <w:pStyle w:val="BodyText"/>
-      </w:pPr>
-      <w:r>
-        <w:t xml:space="preserve">Author (2026a). CorpusKorupsi: A Computational Corpus of Indonesian Supreme Court Corruption Verdicts and Sentencing Patterns. [Companion paper]</w:t>
-      </w:r>
-    </w:p>
-    <w:p>
-      <w:pPr>
-        <w:pStyle w:val="BodyText"/>
-      </w:pPr>
-      <w:r>
-        <w:t xml:space="preserve">Author (2026b). Charge Type, Judicial Opacity, and the Limits of Prediction: A Computational Analysis of Indonesian Corruption Sentences. SSRN Working Paper No. 6574140. https://ssrn.com/abstract=6574140</w:t>
-      </w:r>
-    </w:p>
-    <w:p>
-      <w:pPr>
-        <w:pStyle w:val="BodyText"/>
-      </w:pPr>
-      <w:r>
-        <w:t xml:space="preserve">Author (2026c). Bidirectional Correction: How Indonesian Judges Override Low Prosecution Demands in Corruption Cases. [Companion paper]</w:t>
-      </w:r>
-    </w:p>
-    <w:p>
-      <w:pPr>
-        <w:pStyle w:val="BodyText"/>
-      </w:pPr>
-      <w:r>
-        <w:t xml:space="preserve">Becker, G. S. (1968). Crime and Punishment: An Economic Approach.</w:t>
-      </w:r>
-      <w:r>
-        <w:t xml:space="preserve"> </w:t>
-      </w:r>
-      <w:r>
-        <w:rPr>
-          <w:i/>
-          <w:iCs/>
-        </w:rPr>
-        <w:t xml:space="preserve">Journal of Political Economy</w:t>
-      </w:r>
-      <w:r>
-        <w:t xml:space="preserve">, 76(2), 169-217. https://doi.org/10.1086/259394</w:t>
-      </w:r>
-    </w:p>
-    <w:p>
-      <w:pPr>
-        <w:pStyle w:val="BodyText"/>
-      </w:pPr>
-      <w:r>
-        <w:t xml:space="preserve">Bennett, M. W., Levinson, J. D., &amp; Hioki, K. (2017). Judging Federal White-Collar Fraud Sentencing: An Empirical Study Revealing the Need for Further Reform.</w:t>
-      </w:r>
-      <w:r>
-        <w:t xml:space="preserve"> </w:t>
-      </w:r>
-      <w:r>
-        <w:rPr>
-          <w:i/>
-          <w:iCs/>
-        </w:rPr>
-        <w:t xml:space="preserve">Iowa Law Review</w:t>
-      </w:r>
-      <w:r>
-        <w:t xml:space="preserve">, 102, 939-1000.</w:t>
-      </w:r>
-    </w:p>
-    <w:p>
-      <w:pPr>
-        <w:pStyle w:val="BodyText"/>
-      </w:pPr>
-      <w:r>
-        <w:t xml:space="preserve">Bibas, S. (2004). Plea Bargaining outside the Shadow of Trial.</w:t>
-      </w:r>
-      <w:r>
-        <w:t xml:space="preserve"> </w:t>
-      </w:r>
-      <w:r>
-        <w:rPr>
-          <w:i/>
-          <w:iCs/>
-        </w:rPr>
-        <w:t xml:space="preserve">Harvard Law Review</w:t>
-      </w:r>
-      <w:r>
-        <w:t xml:space="preserve">, 117(8), 2463-2547.</w:t>
-      </w:r>
-    </w:p>
-    <w:p>
-      <w:pPr>
-        <w:pStyle w:val="BodyText"/>
-      </w:pPr>
-      <w:r>
-        <w:t xml:space="preserve">Davis, K. C. (1969).</w:t>
-      </w:r>
-      <w:r>
-        <w:t xml:space="preserve"> </w:t>
-      </w:r>
-      <w:r>
-        <w:rPr>
-          <w:i/>
-          <w:iCs/>
-        </w:rPr>
-        <w:t xml:space="preserve">Discretionary Justice: A Preliminary Inquiry</w:t>
-      </w:r>
-      <w:r>
-        <w:t xml:space="preserve">. Louisiana State University Press.</w:t>
-      </w:r>
-    </w:p>
-    <w:p>
-      <w:pPr>
-        <w:pStyle w:val="BodyText"/>
-      </w:pPr>
-      <w:r>
-        <w:t xml:space="preserve">Englich, B., Mussweiler, T., &amp; Strack, F. (2006). Playing dice with criminal sentences: The influence of irrelevant anchors on experts’ judicial decision making.</w:t>
-      </w:r>
-      <w:r>
-        <w:t xml:space="preserve"> </w:t>
-      </w:r>
-      <w:r>
-        <w:rPr>
-          <w:i/>
-          <w:iCs/>
-        </w:rPr>
-        <w:t xml:space="preserve">Personality and Social Psychology Bulletin</w:t>
-      </w:r>
-      <w:r>
-        <w:t xml:space="preserve">, 32(2), 188-200.</w:t>
-      </w:r>
-    </w:p>
-    <w:p>
-      <w:pPr>
-        <w:pStyle w:val="BodyText"/>
-      </w:pPr>
-      <w:r>
-        <w:t xml:space="preserve">Hewitt, J. (2016). Fifty Shades of Gray: Sentencing Trends in Major White-Collar Cases.</w:t>
-      </w:r>
-      <w:r>
-        <w:t xml:space="preserve"> </w:t>
-      </w:r>
-      <w:r>
-        <w:rPr>
-          <w:i/>
-          <w:iCs/>
-        </w:rPr>
-        <w:t xml:space="preserve">Yale Law Journal</w:t>
-      </w:r>
-      <w:r>
-        <w:t xml:space="preserve">, 125(4), 1018-1071.</w:t>
-      </w:r>
-    </w:p>
-    <w:p>
-      <w:pPr>
-        <w:pStyle w:val="BodyText"/>
-      </w:pPr>
-      <w:r>
-        <w:t xml:space="preserve">Indonesia Corruption Watch (2025). Sentencing trend monitoring report 2024. Jakarta: ICW.</w:t>
-      </w:r>
-    </w:p>
-    <w:p>
-      <w:pPr>
-        <w:pStyle w:val="BodyText"/>
-      </w:pPr>
-      <w:r>
-        <w:t xml:space="preserve">Lambsdorff, J. G. (2007).</w:t>
-      </w:r>
-      <w:r>
-        <w:t xml:space="preserve"> </w:t>
-      </w:r>
-      <w:r>
-        <w:rPr>
-          <w:i/>
-          <w:iCs/>
-        </w:rPr>
-        <w:t xml:space="preserve">The Institutional Economics of Corruption and Reform: Theory, Evidence, and Policy</w:t>
-      </w:r>
-      <w:r>
-        <w:t xml:space="preserve">. Cambridge University Press.</w:t>
-      </w:r>
-    </w:p>
-    <w:p>
-      <w:pPr>
-        <w:pStyle w:val="BodyText"/>
-      </w:pPr>
-      <w:r>
-        <w:t xml:space="preserve">Medvedeva, M., Vols, M., &amp; Wieling, M. (2020). Using machine learning to predict decisions of the European Court of Human Rights.</w:t>
-      </w:r>
-      <w:r>
-        <w:t xml:space="preserve"> </w:t>
-      </w:r>
-      <w:r>
-        <w:rPr>
-          <w:i/>
-          <w:iCs/>
-        </w:rPr>
-        <w:t xml:space="preserve">Artificial Intelligence and Law</w:t>
-      </w:r>
-      <w:r>
-        <w:t xml:space="preserve">, 28(2), 237-266.</w:t>
-      </w:r>
-    </w:p>
-    <w:p>
-      <w:pPr>
-        <w:pStyle w:val="BodyText"/>
-      </w:pPr>
-      <w:r>
-        <w:t xml:space="preserve">Strickson, B., &amp; De La Iglesia, B. (2020). Legal judgement prediction for UK Crown Court criminal cases.</w:t>
-      </w:r>
-      <w:r>
-        <w:t xml:space="preserve"> </w:t>
-      </w:r>
-      <w:r>
-        <w:rPr>
-          <w:i/>
-          <w:iCs/>
-        </w:rPr>
-        <w:t xml:space="preserve">Proceedings of ICAART</w:t>
-      </w:r>
-      <w:r>
-        <w:t xml:space="preserve">, 458-465.</w:t>
-      </w:r>
-    </w:p>
-    <w:p>
-      <w:pPr>
-        <w:pStyle w:val="BodyText"/>
-      </w:pPr>
-      <w:r>
-        <w:t xml:space="preserve">Tversky, A., &amp; Kahneman, D. (1974). Judgment under Uncertainty: Heuristics and Biases.</w:t>
-      </w:r>
-      <w:r>
-        <w:t xml:space="preserve"> </w:t>
-      </w:r>
-      <w:r>
-        <w:rPr>
-          <w:i/>
-          <w:iCs/>
-        </w:rPr>
-        <w:t xml:space="preserve">Science</w:t>
-      </w:r>
-      <w:r>
-        <w:t xml:space="preserve">, 185(4157), 1124-1131. https://doi.org/10.1126/science.185.4157.1124</w:t>
-      </w:r>
-    </w:p>
-    <w:p>
-      <w:pPr>
-        <w:pStyle w:val="BodyText"/>
-      </w:pPr>
-      <w:r>
-        <w:t xml:space="preserve">Ulmer, J. T. (2012). Recent developments and new directions in sentencing research.</w:t>
-      </w:r>
-      <w:r>
-        <w:t xml:space="preserve"> </w:t>
-      </w:r>
-      <w:r>
-        <w:rPr>
-          <w:i/>
-          <w:iCs/>
-        </w:rPr>
-        <w:t xml:space="preserve">Justice Quarterly</w:t>
-      </w:r>
-      <w:r>
-        <w:t xml:space="preserve">, 29(1), 1-40.</w:t>
-      </w:r>
-    </w:p>
-    <w:p>
-      <w:pPr>
-        <w:pStyle w:val="BodyText"/>
-      </w:pPr>
-      <w:r>
-        <w:t xml:space="preserve">United States Sentencing Commission (2013).</w:t>
-      </w:r>
-      <w:r>
-        <w:t xml:space="preserve"> </w:t>
-      </w:r>
-      <w:r>
-        <w:rPr>
-          <w:i/>
-          <w:iCs/>
-        </w:rPr>
-        <w:t xml:space="preserve">Sentencing and Guideline Application Information for §2B1.1 Offenders</w:t>
-      </w:r>
-      <w:r>
-        <w:t xml:space="preserve">. Symposium on Economic Crime. Washington, DC: USSC. https://www.ussc.gov/sites/default/files/pdf/research-and-publications/research-projects-and-surveys/economic-crimes/20130918-19-symposium/Sentencing_Guideline_Application_Info.pdf</w:t>
-      </w:r>
-    </w:p>
-    <w:p>
-      <w:pPr>
-        <w:pStyle w:val="BodyText"/>
-      </w:pPr>
-      <w:r>
-        <w:t xml:space="preserve">United States Sentencing Commission (2024).</w:t>
-      </w:r>
-      <w:r>
-        <w:t xml:space="preserve"> </w:t>
-      </w:r>
-      <w:r>
-        <w:rPr>
-          <w:i/>
-          <w:iCs/>
-        </w:rPr>
-        <w:t xml:space="preserve">Guidelines Manual</w:t>
-      </w:r>
-      <w:r>
-        <w:t xml:space="preserve">, §2B1.1 (Theft, Property Destruction, and Fraud). Washington, DC: USSC.</w:t>
-      </w:r>
-    </w:p>
-    <w:p>
-      <w:pPr>
-        <w:pStyle w:val="BodyText"/>
-      </w:pPr>
-      <w:r>
-        <w:t xml:space="preserve">United States Sentencing Commission (2025).</w:t>
-      </w:r>
-      <w:r>
-        <w:t xml:space="preserve"> </w:t>
-      </w:r>
-      <w:r>
-        <w:rPr>
-          <w:i/>
-          <w:iCs/>
-        </w:rPr>
-        <w:t xml:space="preserve">Proposed Amendments to the Federal Sentencing Guidelines: Economic Crime (§2B1.1 Loss Table)</w:t>
-      </w:r>
-      <w:r>
-        <w:t xml:space="preserve">. Washington, DC: USSC.</w:t>
-      </w:r>
-    </w:p>
-    <w:p>
-      <w:pPr>
-        <w:pStyle w:val="BodyText"/>
-      </w:pPr>
-      <w:r>
-        <w:t xml:space="preserve">van Wingerden, S., van Wilsem, J., &amp; Roosma, F. (2016). Sentencing in the Netherlands: Determinants of severity and judicial consistency.</w:t>
-      </w:r>
-      <w:r>
-        <w:t xml:space="preserve"> </w:t>
-      </w:r>
-      <w:r>
-        <w:rPr>
-          <w:i/>
-          <w:iCs/>
-        </w:rPr>
-        <w:t xml:space="preserve">European Journal of Criminology</w:t>
-      </w:r>
-      <w:r>
-        <w:t xml:space="preserve">, 13(4), 489-512.</w:t>
-      </w:r>
-    </w:p>
-    <w:p>
-      <w:pPr>
-        <w:pStyle w:val="BodyText"/>
-      </w:pPr>
-      <w:r>
-        <w:t xml:space="preserve">von Hirsch, A. (1992). Proportionality in the Philosophy of Punishment.</w:t>
-      </w:r>
-      <w:r>
-        <w:t xml:space="preserve"> </w:t>
-      </w:r>
-      <w:r>
-        <w:rPr>
-          <w:i/>
-          <w:iCs/>
-        </w:rPr>
-        <w:t xml:space="preserve">Crime and Justice</w:t>
-      </w:r>
-      <w:r>
-        <w:t xml:space="preserve">, 16, 55-98. https://doi.org/10.1086/449204</w:t>
-      </w:r>
-    </w:p>
-    <w:p>
-      <w:pPr>
-        <w:pStyle w:val="BodyText"/>
-      </w:pPr>
-      <w:r>
-        <w:t xml:space="preserve">Vorenberg, J. (1981). Decent Restraint of Prosecutorial Power.</w:t>
-      </w:r>
-      <w:r>
-        <w:t xml:space="preserve"> </w:t>
-      </w:r>
-      <w:r>
-        <w:rPr>
-          <w:i/>
-          <w:iCs/>
-        </w:rPr>
-        <w:t xml:space="preserve">Harvard Law Review</w:t>
-      </w:r>
-      <w:r>
-        <w:t xml:space="preserve">, 94(7), 1521-1573.</w:t>
-      </w:r>
-    </w:p>
-    <w:p>
-      <w:pPr>
-        <w:pStyle w:val="BodyText"/>
-      </w:pPr>
-      <w:r>
-        <w:t xml:space="preserve">Wittenbrink, F., &amp; Niehaus, S. (2022). Prediction of Criminal Sentencing: A Systematic Review of Models, Outcomes, and Methodological Issues.</w:t>
-      </w:r>
-      <w:r>
-        <w:t xml:space="preserve"> </w:t>
-      </w:r>
-      <w:r>
-        <w:rPr>
-          <w:i/>
-          <w:iCs/>
-        </w:rPr>
-        <w:t xml:space="preserve">European Journal of Criminology and Police Research</w:t>
-      </w:r>
-      <w:r>
-        <w:t xml:space="preserve">, 28, 349-371.</w:t>
-      </w:r>
-    </w:p>
     <w:bookmarkEnd w:id="34"/>
-    <w:bookmarkEnd w:id="35"/>
     <w:sectPr>
       <w:footnotePr>
         <w:numRestart w:val="eachSect"/>

</xml_diff>